<commit_message>
Uslubiy ishlanma to'liq emas
</commit_message>
<xml_diff>
--- a/Uslubiy ishlanma/УСЛУБИЙ ИШЛАНМА ВАРИАНТ — копия.docx
+++ b/Uslubiy ishlanma/УСЛУБИЙ ИШЛАНМА ВАРИАНТ — копия.docx
@@ -155,6 +155,7 @@
                                 <w:lang w:val="en-US"/>
                               </w:rPr>
                             </w:pPr>
+                            <w:proofErr w:type="gramStart"/>
                             <w:r>
                               <w:rPr>
                                 <w:bCs/>
@@ -162,7 +163,17 @@
                                 <w:szCs w:val="28"/>
                                 <w:lang w:val="en-US"/>
                               </w:rPr>
-                              <w:t xml:space="preserve">O‘R HX VA MU AKT VA HAI </w:t>
+                              <w:t>O‘</w:t>
+                            </w:r>
+                            <w:proofErr w:type="gramEnd"/>
+                            <w:r>
+                              <w:rPr>
+                                <w:bCs/>
+                                <w:sz w:val="24"/>
+                                <w:szCs w:val="28"/>
+                                <w:lang w:val="en-US"/>
+                              </w:rPr>
+                              <w:t xml:space="preserve">R HX VA MU AKT VA HAI </w:t>
                             </w:r>
                           </w:p>
                           <w:p>
@@ -209,13 +220,23 @@
                               </w:rPr>
                               <w:t xml:space="preserve"> </w:t>
                             </w:r>
+                            <w:proofErr w:type="gramStart"/>
                             <w:r>
                               <w:rPr>
                                 <w:sz w:val="24"/>
                                 <w:szCs w:val="28"/>
                                 <w:lang w:val="uz-Cyrl-UZ"/>
                               </w:rPr>
-                              <w:t>BOSHLIG‘I</w:t>
+                              <w:t>BOSHLIG‘</w:t>
+                            </w:r>
+                            <w:proofErr w:type="gramEnd"/>
+                            <w:r>
+                              <w:rPr>
+                                <w:sz w:val="24"/>
+                                <w:szCs w:val="28"/>
+                                <w:lang w:val="uz-Cyrl-UZ"/>
+                              </w:rPr>
+                              <w:t>I</w:t>
                             </w:r>
                           </w:p>
                           <w:p>
@@ -256,6 +277,7 @@
                                 <w:lang w:val="en-US"/>
                               </w:rPr>
                             </w:pPr>
+                            <w:proofErr w:type="gramStart"/>
                             <w:r>
                               <w:rPr>
                                 <w:sz w:val="28"/>
@@ -282,6 +304,7 @@
                               <w:t>Yusupov</w:t>
                             </w:r>
                             <w:proofErr w:type="spellEnd"/>
+                            <w:proofErr w:type="gramEnd"/>
                           </w:p>
                           <w:p>
                             <w:pPr>
@@ -418,6 +441,7 @@
                           <w:lang w:val="en-US"/>
                         </w:rPr>
                       </w:pPr>
+                      <w:proofErr w:type="gramStart"/>
                       <w:r>
                         <w:rPr>
                           <w:bCs/>
@@ -425,7 +449,17 @@
                           <w:szCs w:val="28"/>
                           <w:lang w:val="en-US"/>
                         </w:rPr>
-                        <w:t xml:space="preserve">O‘R HX VA MU AKT VA HAI </w:t>
+                        <w:t>O‘</w:t>
+                      </w:r>
+                      <w:proofErr w:type="gramEnd"/>
+                      <w:r>
+                        <w:rPr>
+                          <w:bCs/>
+                          <w:sz w:val="24"/>
+                          <w:szCs w:val="28"/>
+                          <w:lang w:val="en-US"/>
+                        </w:rPr>
+                        <w:t xml:space="preserve">R HX VA MU AKT VA HAI </w:t>
                       </w:r>
                     </w:p>
                     <w:p>
@@ -472,13 +506,23 @@
                         </w:rPr>
                         <w:t xml:space="preserve"> </w:t>
                       </w:r>
+                      <w:proofErr w:type="gramStart"/>
                       <w:r>
                         <w:rPr>
                           <w:sz w:val="24"/>
                           <w:szCs w:val="28"/>
                           <w:lang w:val="uz-Cyrl-UZ"/>
                         </w:rPr>
-                        <w:t>BOSHLIG‘I</w:t>
+                        <w:t>BOSHLIG‘</w:t>
+                      </w:r>
+                      <w:proofErr w:type="gramEnd"/>
+                      <w:r>
+                        <w:rPr>
+                          <w:sz w:val="24"/>
+                          <w:szCs w:val="28"/>
+                          <w:lang w:val="uz-Cyrl-UZ"/>
+                        </w:rPr>
+                        <w:t>I</w:t>
                       </w:r>
                     </w:p>
                     <w:p>
@@ -519,6 +563,7 @@
                           <w:lang w:val="en-US"/>
                         </w:rPr>
                       </w:pPr>
+                      <w:proofErr w:type="gramStart"/>
                       <w:r>
                         <w:rPr>
                           <w:sz w:val="28"/>
@@ -545,6 +590,7 @@
                         <w:t>Yusupov</w:t>
                       </w:r>
                       <w:proofErr w:type="spellEnd"/>
+                      <w:proofErr w:type="gramEnd"/>
                     </w:p>
                     <w:p>
                       <w:pPr>
@@ -827,13 +873,23 @@
         <w:t xml:space="preserve"> </w:t>
       </w:r>
       <w:proofErr w:type="spellStart"/>
-      <w:r>
-        <w:rPr>
-          <w:sz w:val="28"/>
-          <w:szCs w:val="28"/>
-          <w:lang w:val="en-US"/>
-        </w:rPr>
-        <w:t>o‘quv</w:t>
+      <w:proofErr w:type="gramStart"/>
+      <w:r>
+        <w:rPr>
+          <w:sz w:val="28"/>
+          <w:szCs w:val="28"/>
+          <w:lang w:val="en-US"/>
+        </w:rPr>
+        <w:t>o‘</w:t>
+      </w:r>
+      <w:proofErr w:type="gramEnd"/>
+      <w:r>
+        <w:rPr>
+          <w:sz w:val="28"/>
+          <w:szCs w:val="28"/>
+          <w:lang w:val="en-US"/>
+        </w:rPr>
+        <w:t>quv</w:t>
       </w:r>
       <w:proofErr w:type="spellEnd"/>
       <w:r>
@@ -918,6 +974,7 @@
           <w:lang w:val="en-US"/>
         </w:rPr>
       </w:pPr>
+      <w:proofErr w:type="gramStart"/>
       <w:r>
         <w:rPr>
           <w:sz w:val="28"/>
@@ -926,6 +983,7 @@
         </w:rPr>
         <w:t>USLUBIY  ISHLANMA</w:t>
       </w:r>
+      <w:proofErr w:type="gramEnd"/>
     </w:p>
     <w:p>
       <w:pPr>
@@ -972,7 +1030,7 @@
           <w:szCs w:val="28"/>
           <w:lang w:val="en-US"/>
         </w:rPr>
-        <w:t>MAVZU: «</w:t>
+        <w:t xml:space="preserve">MAVZU: </w:t>
       </w:r>
       <w:r>
         <w:rPr>
@@ -1115,40 +1173,24 @@
           <w:szCs w:val="28"/>
           <w:lang w:val="en-US"/>
         </w:rPr>
-        <w:t>tushunchalari</w:t>
-      </w:r>
-      <w:proofErr w:type="spellEnd"/>
-      <w:r>
-        <w:rPr>
-          <w:sz w:val="28"/>
-          <w:szCs w:val="28"/>
-          <w:lang w:val="en-US"/>
-        </w:rPr>
-        <w:t>».</w:t>
-      </w:r>
-    </w:p>
-    <w:p>
-      <w:pPr>
-        <w:tabs>
-          <w:tab w:val="left" w:pos="284"/>
-        </w:tabs>
-        <w:ind w:right="271" w:firstLine="335"/>
-        <w:jc w:val="both"/>
-        <w:rPr>
-          <w:bCs/>
-          <w:sz w:val="28"/>
-          <w:szCs w:val="28"/>
-          <w:lang w:val="uz-Cyrl-UZ"/>
-        </w:rPr>
-      </w:pPr>
-      <w:r>
-        <w:rPr>
-          <w:bCs/>
-          <w:sz w:val="28"/>
-          <w:szCs w:val="28"/>
-          <w:lang w:val="uz-Cyrl-UZ"/>
-        </w:rPr>
-        <w:t>14-mashg‘ulot. Pythonda OOP asoslari.</w:t>
+        <w:t>tushunchalar</w:t>
+      </w:r>
+      <w:r>
+        <w:rPr>
+          <w:sz w:val="28"/>
+          <w:szCs w:val="28"/>
+          <w:lang w:val="en-US"/>
+        </w:rPr>
+        <w:t>i</w:t>
+      </w:r>
+      <w:proofErr w:type="spellEnd"/>
+      <w:r>
+        <w:rPr>
+          <w:sz w:val="28"/>
+          <w:szCs w:val="28"/>
+          <w:lang w:val="en-US"/>
+        </w:rPr>
+        <w:t>.</w:t>
       </w:r>
     </w:p>
     <w:p>
@@ -1456,6 +1498,7 @@
         <w:t xml:space="preserve"> </w:t>
       </w:r>
       <w:proofErr w:type="spellStart"/>
+      <w:proofErr w:type="gramStart"/>
       <w:r>
         <w:rPr>
           <w:sz w:val="24"/>
@@ -1472,6 +1515,7 @@
         </w:rPr>
         <w:t>‘</w:t>
       </w:r>
+      <w:proofErr w:type="gramEnd"/>
       <w:r>
         <w:rPr>
           <w:sz w:val="24"/>
@@ -1779,30 +1823,6 @@
     </w:p>
     <w:p>
       <w:pPr>
-        <w:tabs>
-          <w:tab w:val="left" w:pos="270"/>
-        </w:tabs>
-        <w:ind w:right="271" w:firstLine="709"/>
-        <w:jc w:val="both"/>
-        <w:rPr>
-          <w:bCs/>
-          <w:sz w:val="28"/>
-          <w:szCs w:val="28"/>
-          <w:lang w:val="uz-Cyrl-UZ"/>
-        </w:rPr>
-      </w:pPr>
-      <w:r>
-        <w:rPr>
-          <w:bCs/>
-          <w:sz w:val="28"/>
-          <w:szCs w:val="28"/>
-          <w:lang w:val="uz-Cyrl-UZ"/>
-        </w:rPr>
-        <w:t>14-mashg‘ulot. Pythonda OOP asoslari.</w:t>
-      </w:r>
-    </w:p>
-    <w:p>
-      <w:pPr>
         <w:pStyle w:val="af"/>
         <w:ind w:right="271" w:firstLine="709"/>
         <w:rPr>
@@ -1813,6 +1833,8 @@
           <w:lang w:val="uz-Cyrl-UZ"/>
         </w:rPr>
       </w:pPr>
+      <w:bookmarkStart w:id="0" w:name="_GoBack"/>
+      <w:bookmarkEnd w:id="0"/>
     </w:p>
     <w:p>
       <w:pPr>
@@ -2142,13 +2164,23 @@
         </w:rPr>
       </w:pPr>
       <w:proofErr w:type="spellStart"/>
-      <w:r>
-        <w:rPr>
-          <w:sz w:val="28"/>
-          <w:szCs w:val="28"/>
-          <w:lang w:val="en-US"/>
-        </w:rPr>
-        <w:t>O‘quv</w:t>
+      <w:proofErr w:type="gramStart"/>
+      <w:r>
+        <w:rPr>
+          <w:sz w:val="28"/>
+          <w:szCs w:val="28"/>
+          <w:lang w:val="en-US"/>
+        </w:rPr>
+        <w:t>O‘</w:t>
+      </w:r>
+      <w:proofErr w:type="gramEnd"/>
+      <w:r>
+        <w:rPr>
+          <w:sz w:val="28"/>
+          <w:szCs w:val="28"/>
+          <w:lang w:val="en-US"/>
+        </w:rPr>
+        <w:t>quv</w:t>
       </w:r>
       <w:proofErr w:type="spellEnd"/>
       <w:r>
@@ -2299,13 +2331,23 @@
               </w:rPr>
             </w:pPr>
             <w:proofErr w:type="spellStart"/>
+            <w:proofErr w:type="gramStart"/>
             <w:r>
               <w:rPr>
                 <w:sz w:val="24"/>
                 <w:szCs w:val="28"/>
                 <w:lang w:val="en-US"/>
               </w:rPr>
-              <w:t>Mashg‘ulot</w:t>
+              <w:t>Mashg‘</w:t>
+            </w:r>
+            <w:proofErr w:type="gramEnd"/>
+            <w:r>
+              <w:rPr>
+                <w:sz w:val="24"/>
+                <w:szCs w:val="28"/>
+                <w:lang w:val="en-US"/>
+              </w:rPr>
+              <w:t>ulot</w:t>
             </w:r>
             <w:proofErr w:type="spellEnd"/>
             <w:r>
@@ -18129,7 +18171,7 @@
         </w:rPr>
         <w:t xml:space="preserve">” </w:t>
       </w:r>
-      <w:bookmarkStart w:id="0" w:name="3497212"/>
+      <w:bookmarkStart w:id="1" w:name="3497212"/>
       <w:r>
         <w:rPr>
           <w:sz w:val="28"/>
@@ -18162,7 +18204,7 @@
         </w:rPr>
         <w:t xml:space="preserve"> </w:t>
       </w:r>
-      <w:bookmarkStart w:id="1" w:name="3497351"/>
+      <w:bookmarkStart w:id="2" w:name="3497351"/>
       <w:r>
         <w:rPr>
           <w:sz w:val="28"/>
@@ -18379,7 +18421,7 @@
         </w:rPr>
         <w:t>Kuchlarini</w:t>
       </w:r>
-      <w:bookmarkEnd w:id="1"/>
+      <w:bookmarkEnd w:id="2"/>
       <w:r>
         <w:rPr>
           <w:sz w:val="28"/>
@@ -18388,7 +18430,7 @@
         </w:rPr>
         <w:t>,</w:t>
       </w:r>
-      <w:bookmarkStart w:id="2" w:name="3497352"/>
+      <w:bookmarkStart w:id="3" w:name="3497352"/>
       <w:r>
         <w:rPr>
           <w:sz w:val="28"/>
@@ -18453,7 +18495,7 @@
         </w:rPr>
         <w:t>etish</w:t>
       </w:r>
-      <w:bookmarkEnd w:id="2"/>
+      <w:bookmarkEnd w:id="3"/>
       <w:r>
         <w:rPr>
           <w:sz w:val="28"/>
@@ -18462,7 +18504,7 @@
         </w:rPr>
         <w:t>,</w:t>
       </w:r>
-      <w:bookmarkStart w:id="3" w:name="3497353"/>
+      <w:bookmarkStart w:id="4" w:name="3497353"/>
       <w:r>
         <w:rPr>
           <w:sz w:val="28"/>
@@ -18687,7 +18729,7 @@
         </w:rPr>
         <w:t>kurashish</w:t>
       </w:r>
-      <w:bookmarkEnd w:id="3"/>
+      <w:bookmarkEnd w:id="4"/>
       <w:r>
         <w:rPr>
           <w:sz w:val="28"/>
@@ -18696,7 +18738,7 @@
         </w:rPr>
         <w:t>,</w:t>
       </w:r>
-      <w:bookmarkStart w:id="4" w:name="3497354"/>
+      <w:bookmarkStart w:id="5" w:name="3497354"/>
       <w:r>
         <w:rPr>
           <w:sz w:val="28"/>
@@ -18777,7 +18819,7 @@
         </w:rPr>
         <w:t>etish</w:t>
       </w:r>
-      <w:bookmarkEnd w:id="4"/>
+      <w:bookmarkEnd w:id="5"/>
       <w:r>
         <w:rPr>
           <w:sz w:val="28"/>
@@ -18786,7 +18828,7 @@
         </w:rPr>
         <w:t>,</w:t>
       </w:r>
-      <w:bookmarkStart w:id="5" w:name="3497355"/>
+      <w:bookmarkStart w:id="6" w:name="3497355"/>
       <w:r>
         <w:rPr>
           <w:sz w:val="28"/>
@@ -19003,7 +19045,7 @@
         </w:rPr>
         <w:t>.</w:t>
       </w:r>
-      <w:bookmarkEnd w:id="5"/>
+      <w:bookmarkEnd w:id="6"/>
     </w:p>
     <w:p>
       <w:pPr>
@@ -19520,7 +19562,7 @@
         </w:rPr>
         <w:t>kiradi</w:t>
       </w:r>
-      <w:bookmarkStart w:id="6" w:name="3497426"/>
+      <w:bookmarkStart w:id="7" w:name="3497426"/>
     </w:p>
     <w:p>
       <w:pPr>
@@ -19550,8 +19592,8 @@
         </w:rPr>
         <w:t xml:space="preserve"> Qurolli Kuchlarning son jihatdan ko‘p bo‘lgan turi hisoblanib, Davlat chegarasini himoya qilish, agressorning operatsion yo‘nalishlar va boshqa yo‘nalishlardagi zarbasini qaytarish, qo‘shin turkumlarini tor-mor keltirish, egallangan hudud va marralarni qo‘lda saqlab qolish, dushman egallagan hududni, uning qo‘shin turkumlarini oxirigacha yakson qilish maqsadida zabt etish, shuningdek, qurolli mojarolarda dushmanning muntazam va nomuntazam tuzilmalarini yakson qilishga qaratilgan jangovar harakatlar va qo‘shinlar maxsus harakatlarni olib borish uchun mo‘ljallangan. Quruqlikdagi qo‘shinlar o‘z ichiga motoo‘qchi, tank, havo-desant qo‘shinlari, artilleriya, qo‘shin turlariga kiruvchi HHM qo‘shinlari (bo‘linmalari) va maxsus operatsiyalar kuchlari, shuningdek, maxsus qo‘shinlar bo‘lgan (razvedka, radioelektron kurash, muhandislik, radiatsion, kimyoviy va biologik muhofaza qilish, aloqa, radiotexnik va texnik ta’minot), urush vaqtidagi hududiy va front orti ta’minoti qo‘shinlari mujassam et</w:t>
       </w:r>
-      <w:bookmarkEnd w:id="0"/>
-      <w:bookmarkEnd w:id="6"/>
+      <w:bookmarkEnd w:id="1"/>
+      <w:bookmarkEnd w:id="7"/>
       <w:r>
         <w:rPr>
           <w:sz w:val="28"/>
@@ -22720,6 +22762,7 @@
         <w:t xml:space="preserve">” </w:t>
       </w:r>
       <w:proofErr w:type="spellStart"/>
+      <w:proofErr w:type="gramStart"/>
       <w:r>
         <w:rPr>
           <w:i/>
@@ -22740,6 +22783,7 @@
         <w:t>Ushbu</w:t>
       </w:r>
       <w:proofErr w:type="spellEnd"/>
+      <w:proofErr w:type="gramEnd"/>
       <w:r>
         <w:rPr>
           <w:sz w:val="28"/>
@@ -23050,14 +23094,25 @@
         <w:t xml:space="preserve"> </w:t>
       </w:r>
       <w:proofErr w:type="spellStart"/>
-      <w:r>
-        <w:rPr>
-          <w:sz w:val="28"/>
-          <w:szCs w:val="28"/>
-          <w:shd w:val="clear" w:color="auto" w:fill="FFFFFF"/>
-          <w:lang w:val="en-US"/>
-        </w:rPr>
-        <w:t>o‘z</w:t>
+      <w:proofErr w:type="gramStart"/>
+      <w:r>
+        <w:rPr>
+          <w:sz w:val="28"/>
+          <w:szCs w:val="28"/>
+          <w:shd w:val="clear" w:color="auto" w:fill="FFFFFF"/>
+          <w:lang w:val="en-US"/>
+        </w:rPr>
+        <w:t>o‘</w:t>
+      </w:r>
+      <w:proofErr w:type="gramEnd"/>
+      <w:r>
+        <w:rPr>
+          <w:sz w:val="28"/>
+          <w:szCs w:val="28"/>
+          <w:shd w:val="clear" w:color="auto" w:fill="FFFFFF"/>
+          <w:lang w:val="en-US"/>
+        </w:rPr>
+        <w:t>z</w:t>
       </w:r>
       <w:proofErr w:type="spellEnd"/>
       <w:r>
@@ -23447,14 +23502,25 @@
         <w:t xml:space="preserve"> </w:t>
       </w:r>
       <w:proofErr w:type="spellStart"/>
-      <w:r>
-        <w:rPr>
-          <w:sz w:val="28"/>
-          <w:szCs w:val="28"/>
-          <w:shd w:val="clear" w:color="auto" w:fill="FFFFFF"/>
-          <w:lang w:val="en-US"/>
-        </w:rPr>
-        <w:t>o‘z-o‘zini</w:t>
+      <w:proofErr w:type="gramStart"/>
+      <w:r>
+        <w:rPr>
+          <w:sz w:val="28"/>
+          <w:szCs w:val="28"/>
+          <w:shd w:val="clear" w:color="auto" w:fill="FFFFFF"/>
+          <w:lang w:val="en-US"/>
+        </w:rPr>
+        <w:t>o‘</w:t>
+      </w:r>
+      <w:proofErr w:type="gramEnd"/>
+      <w:r>
+        <w:rPr>
+          <w:sz w:val="28"/>
+          <w:szCs w:val="28"/>
+          <w:shd w:val="clear" w:color="auto" w:fill="FFFFFF"/>
+          <w:lang w:val="en-US"/>
+        </w:rPr>
+        <w:t>z-o‘zini</w:t>
       </w:r>
       <w:proofErr w:type="spellEnd"/>
       <w:r>
@@ -25023,14 +25089,25 @@
         <w:t xml:space="preserve"> </w:t>
       </w:r>
       <w:proofErr w:type="spellStart"/>
-      <w:r>
-        <w:rPr>
-          <w:sz w:val="28"/>
-          <w:szCs w:val="28"/>
-          <w:shd w:val="clear" w:color="auto" w:fill="FFFFFF"/>
-          <w:lang w:val="en-US"/>
-        </w:rPr>
-        <w:t>mashg‘ulotda</w:t>
+      <w:proofErr w:type="gramStart"/>
+      <w:r>
+        <w:rPr>
+          <w:sz w:val="28"/>
+          <w:szCs w:val="28"/>
+          <w:shd w:val="clear" w:color="auto" w:fill="FFFFFF"/>
+          <w:lang w:val="en-US"/>
+        </w:rPr>
+        <w:t>mashg‘</w:t>
+      </w:r>
+      <w:proofErr w:type="gramEnd"/>
+      <w:r>
+        <w:rPr>
+          <w:sz w:val="28"/>
+          <w:szCs w:val="28"/>
+          <w:shd w:val="clear" w:color="auto" w:fill="FFFFFF"/>
+          <w:lang w:val="en-US"/>
+        </w:rPr>
+        <w:t>ulotda</w:t>
       </w:r>
       <w:proofErr w:type="spellEnd"/>
       <w:r>
@@ -26653,14 +26730,25 @@
         <w:t xml:space="preserve"> </w:t>
       </w:r>
       <w:proofErr w:type="spellStart"/>
-      <w:r>
-        <w:rPr>
-          <w:sz w:val="28"/>
-          <w:szCs w:val="28"/>
-          <w:shd w:val="clear" w:color="auto" w:fill="FFFFFF"/>
-          <w:lang w:val="en-US"/>
-        </w:rPr>
-        <w:t>mashg‘ulot</w:t>
+      <w:proofErr w:type="gramStart"/>
+      <w:r>
+        <w:rPr>
+          <w:sz w:val="28"/>
+          <w:szCs w:val="28"/>
+          <w:shd w:val="clear" w:color="auto" w:fill="FFFFFF"/>
+          <w:lang w:val="en-US"/>
+        </w:rPr>
+        <w:t>mashg‘</w:t>
+      </w:r>
+      <w:proofErr w:type="gramEnd"/>
+      <w:r>
+        <w:rPr>
+          <w:sz w:val="28"/>
+          <w:szCs w:val="28"/>
+          <w:shd w:val="clear" w:color="auto" w:fill="FFFFFF"/>
+          <w:lang w:val="en-US"/>
+        </w:rPr>
+        <w:t>ulot</w:t>
       </w:r>
       <w:proofErr w:type="spellEnd"/>
       <w:r>
@@ -26993,14 +27081,25 @@
         <w:t xml:space="preserve"> </w:t>
       </w:r>
       <w:proofErr w:type="spellStart"/>
-      <w:r>
-        <w:rPr>
-          <w:sz w:val="28"/>
-          <w:szCs w:val="28"/>
-          <w:shd w:val="clear" w:color="auto" w:fill="FFFFFF"/>
-          <w:lang w:val="en-US"/>
-        </w:rPr>
-        <w:t>bo‘ladi</w:t>
+      <w:proofErr w:type="gramStart"/>
+      <w:r>
+        <w:rPr>
+          <w:sz w:val="28"/>
+          <w:szCs w:val="28"/>
+          <w:shd w:val="clear" w:color="auto" w:fill="FFFFFF"/>
+          <w:lang w:val="en-US"/>
+        </w:rPr>
+        <w:t>bo‘</w:t>
+      </w:r>
+      <w:proofErr w:type="gramEnd"/>
+      <w:r>
+        <w:rPr>
+          <w:sz w:val="28"/>
+          <w:szCs w:val="28"/>
+          <w:shd w:val="clear" w:color="auto" w:fill="FFFFFF"/>
+          <w:lang w:val="en-US"/>
+        </w:rPr>
+        <w:t>ladi</w:t>
       </w:r>
       <w:proofErr w:type="spellEnd"/>
       <w:r>
@@ -27028,6 +27127,7 @@
         </w:rPr>
       </w:pPr>
       <w:proofErr w:type="spellStart"/>
+      <w:proofErr w:type="gramStart"/>
       <w:r>
         <w:rPr>
           <w:i/>
@@ -27037,7 +27137,19 @@
           <w:shd w:val="clear" w:color="auto" w:fill="FFFFFF"/>
           <w:lang w:val="en-US"/>
         </w:rPr>
-        <w:t>Mashg‘ulotda</w:t>
+        <w:t>Mashg‘</w:t>
+      </w:r>
+      <w:proofErr w:type="gramEnd"/>
+      <w:r>
+        <w:rPr>
+          <w:i/>
+          <w:iCs/>
+          <w:sz w:val="28"/>
+          <w:szCs w:val="28"/>
+          <w:shd w:val="clear" w:color="auto" w:fill="FFFFFF"/>
+          <w:lang w:val="en-US"/>
+        </w:rPr>
+        <w:t>ulotda</w:t>
       </w:r>
       <w:proofErr w:type="spellEnd"/>
       <w:r>
@@ -27792,6 +27904,7 @@
         <w:t xml:space="preserve"> </w:t>
       </w:r>
       <w:proofErr w:type="spellStart"/>
+      <w:proofErr w:type="gramStart"/>
       <w:r>
         <w:rPr>
           <w:i/>
@@ -27801,7 +27914,19 @@
           <w:shd w:val="clear" w:color="auto" w:fill="FFFFFF"/>
           <w:lang w:val="en-US"/>
         </w:rPr>
-        <w:t>bo‘yicha</w:t>
+        <w:t>bo‘</w:t>
+      </w:r>
+      <w:proofErr w:type="gramEnd"/>
+      <w:r>
+        <w:rPr>
+          <w:i/>
+          <w:iCs/>
+          <w:sz w:val="28"/>
+          <w:szCs w:val="28"/>
+          <w:shd w:val="clear" w:color="auto" w:fill="FFFFFF"/>
+          <w:lang w:val="en-US"/>
+        </w:rPr>
+        <w:t>yicha</w:t>
       </w:r>
       <w:proofErr w:type="spellEnd"/>
       <w:r>
@@ -28201,6 +28326,7 @@
         </w:rPr>
       </w:pPr>
       <w:proofErr w:type="spellStart"/>
+      <w:proofErr w:type="gramStart"/>
       <w:r>
         <w:rPr>
           <w:i/>
@@ -28209,7 +28335,18 @@
           <w:szCs w:val="28"/>
           <w:lang w:val="en-US"/>
         </w:rPr>
-        <w:t>Mashg‘ulotni</w:t>
+        <w:t>Mashg‘</w:t>
+      </w:r>
+      <w:proofErr w:type="gramEnd"/>
+      <w:r>
+        <w:rPr>
+          <w:i/>
+          <w:iCs/>
+          <w:sz w:val="28"/>
+          <w:szCs w:val="28"/>
+          <w:lang w:val="en-US"/>
+        </w:rPr>
+        <w:t>ulotni</w:t>
       </w:r>
       <w:proofErr w:type="spellEnd"/>
       <w:r>
@@ -30113,14 +30250,25 @@
         <w:t xml:space="preserve"> </w:t>
       </w:r>
       <w:proofErr w:type="spellStart"/>
-      <w:r>
-        <w:rPr>
-          <w:sz w:val="28"/>
-          <w:szCs w:val="28"/>
-          <w:shd w:val="clear" w:color="auto" w:fill="FFFFFF"/>
-          <w:lang w:val="en-US"/>
-        </w:rPr>
-        <w:t>bo‘yicha</w:t>
+      <w:proofErr w:type="gramStart"/>
+      <w:r>
+        <w:rPr>
+          <w:sz w:val="28"/>
+          <w:szCs w:val="28"/>
+          <w:shd w:val="clear" w:color="auto" w:fill="FFFFFF"/>
+          <w:lang w:val="en-US"/>
+        </w:rPr>
+        <w:t>bo‘</w:t>
+      </w:r>
+      <w:proofErr w:type="gramEnd"/>
+      <w:r>
+        <w:rPr>
+          <w:sz w:val="28"/>
+          <w:szCs w:val="28"/>
+          <w:shd w:val="clear" w:color="auto" w:fill="FFFFFF"/>
+          <w:lang w:val="en-US"/>
+        </w:rPr>
+        <w:t>yicha</w:t>
       </w:r>
       <w:proofErr w:type="spellEnd"/>
       <w:r>
@@ -31527,14 +31675,25 @@
         </w:rPr>
       </w:pPr>
       <w:proofErr w:type="spellStart"/>
-      <w:r>
-        <w:rPr>
-          <w:sz w:val="28"/>
-          <w:szCs w:val="28"/>
-          <w:shd w:val="clear" w:color="auto" w:fill="FFFFFF"/>
-          <w:lang w:val="en-US"/>
-        </w:rPr>
-        <w:t>o‘qituvchi</w:t>
+      <w:proofErr w:type="gramStart"/>
+      <w:r>
+        <w:rPr>
+          <w:sz w:val="28"/>
+          <w:szCs w:val="28"/>
+          <w:shd w:val="clear" w:color="auto" w:fill="FFFFFF"/>
+          <w:lang w:val="en-US"/>
+        </w:rPr>
+        <w:t>o‘</w:t>
+      </w:r>
+      <w:proofErr w:type="gramEnd"/>
+      <w:r>
+        <w:rPr>
+          <w:sz w:val="28"/>
+          <w:szCs w:val="28"/>
+          <w:shd w:val="clear" w:color="auto" w:fill="FFFFFF"/>
+          <w:lang w:val="en-US"/>
+        </w:rPr>
+        <w:t>qituvchi</w:t>
       </w:r>
       <w:proofErr w:type="spellEnd"/>
       <w:r>
@@ -32030,14 +32189,25 @@
         <w:t xml:space="preserve"> </w:t>
       </w:r>
       <w:proofErr w:type="spellStart"/>
-      <w:r>
-        <w:rPr>
-          <w:sz w:val="28"/>
-          <w:szCs w:val="28"/>
-          <w:shd w:val="clear" w:color="auto" w:fill="FFFFFF"/>
-          <w:lang w:val="en-US"/>
-        </w:rPr>
-        <w:t>o‘quv</w:t>
+      <w:proofErr w:type="gramStart"/>
+      <w:r>
+        <w:rPr>
+          <w:sz w:val="28"/>
+          <w:szCs w:val="28"/>
+          <w:shd w:val="clear" w:color="auto" w:fill="FFFFFF"/>
+          <w:lang w:val="en-US"/>
+        </w:rPr>
+        <w:t>o‘</w:t>
+      </w:r>
+      <w:proofErr w:type="gramEnd"/>
+      <w:r>
+        <w:rPr>
+          <w:sz w:val="28"/>
+          <w:szCs w:val="28"/>
+          <w:shd w:val="clear" w:color="auto" w:fill="FFFFFF"/>
+          <w:lang w:val="en-US"/>
+        </w:rPr>
+        <w:t>quv</w:t>
       </w:r>
       <w:proofErr w:type="spellEnd"/>
       <w:r>
@@ -32365,6 +32535,7 @@
           <w:lang w:val="en-US"/>
         </w:rPr>
       </w:pPr>
+      <w:proofErr w:type="gramStart"/>
       <w:r>
         <w:rPr>
           <w:bCs/>
@@ -32372,7 +32543,17 @@
           <w:szCs w:val="24"/>
           <w:lang w:val="en-US"/>
         </w:rPr>
-        <w:t>O‘QUV</w:t>
+        <w:t>O‘</w:t>
+      </w:r>
+      <w:proofErr w:type="gramEnd"/>
+      <w:r>
+        <w:rPr>
+          <w:bCs/>
+          <w:sz w:val="24"/>
+          <w:szCs w:val="24"/>
+          <w:lang w:val="en-US"/>
+        </w:rPr>
+        <w:t>QUV</w:t>
       </w:r>
       <w:r>
         <w:rPr>
@@ -32468,13 +32649,23 @@
               </w:rPr>
             </w:pPr>
             <w:proofErr w:type="spellStart"/>
+            <w:proofErr w:type="gramStart"/>
             <w:r>
               <w:rPr>
                 <w:sz w:val="18"/>
                 <w:shd w:val="clear" w:color="auto" w:fill="FFFFFF"/>
                 <w:lang w:val="en-US"/>
               </w:rPr>
-              <w:t>O‘tilgan</w:t>
+              <w:t>O‘</w:t>
+            </w:r>
+            <w:proofErr w:type="gramEnd"/>
+            <w:r>
+              <w:rPr>
+                <w:sz w:val="18"/>
+                <w:shd w:val="clear" w:color="auto" w:fill="FFFFFF"/>
+                <w:lang w:val="en-US"/>
+              </w:rPr>
+              <w:t>tilgan</w:t>
             </w:r>
             <w:proofErr w:type="spellEnd"/>
             <w:r>
@@ -32617,13 +32808,23 @@
               </w:rPr>
             </w:pPr>
             <w:proofErr w:type="spellStart"/>
+            <w:proofErr w:type="gramStart"/>
             <w:r>
               <w:rPr>
                 <w:sz w:val="18"/>
                 <w:shd w:val="clear" w:color="auto" w:fill="FFFFFF"/>
                 <w:lang w:val="en-US"/>
               </w:rPr>
-              <w:t>O‘tilgan</w:t>
+              <w:t>O‘</w:t>
+            </w:r>
+            <w:proofErr w:type="gramEnd"/>
+            <w:r>
+              <w:rPr>
+                <w:sz w:val="18"/>
+                <w:shd w:val="clear" w:color="auto" w:fill="FFFFFF"/>
+                <w:lang w:val="en-US"/>
+              </w:rPr>
+              <w:t>tilgan</w:t>
             </w:r>
             <w:proofErr w:type="spellEnd"/>
             <w:r>
@@ -32815,13 +33016,23 @@
               <w:t xml:space="preserve"> </w:t>
             </w:r>
             <w:proofErr w:type="spellStart"/>
+            <w:proofErr w:type="gramStart"/>
             <w:r>
               <w:rPr>
                 <w:sz w:val="18"/>
                 <w:shd w:val="clear" w:color="auto" w:fill="FFFFFF"/>
                 <w:lang w:val="en-US"/>
               </w:rPr>
-              <w:t>bo‘lajak</w:t>
+              <w:t>bo‘</w:t>
+            </w:r>
+            <w:proofErr w:type="gramEnd"/>
+            <w:r>
+              <w:rPr>
+                <w:sz w:val="18"/>
+                <w:shd w:val="clear" w:color="auto" w:fill="FFFFFF"/>
+                <w:lang w:val="en-US"/>
+              </w:rPr>
+              <w:t>lajak</w:t>
             </w:r>
             <w:proofErr w:type="spellEnd"/>
             <w:r>
@@ -33040,13 +33251,23 @@
               </w:rPr>
             </w:pPr>
             <w:proofErr w:type="spellStart"/>
+            <w:proofErr w:type="gramStart"/>
             <w:r>
               <w:rPr>
                 <w:sz w:val="18"/>
                 <w:shd w:val="clear" w:color="auto" w:fill="FFFFFF"/>
                 <w:lang w:val="en-US"/>
               </w:rPr>
-              <w:t>O‘tilgan</w:t>
+              <w:t>O‘</w:t>
+            </w:r>
+            <w:proofErr w:type="gramEnd"/>
+            <w:r>
+              <w:rPr>
+                <w:sz w:val="18"/>
+                <w:shd w:val="clear" w:color="auto" w:fill="FFFFFF"/>
+                <w:lang w:val="en-US"/>
+              </w:rPr>
+              <w:t>tilgan</w:t>
             </w:r>
             <w:proofErr w:type="spellEnd"/>
             <w:r>
@@ -33402,7 +33623,25 @@
                 <w:shd w:val="clear" w:color="auto" w:fill="FFFFFF"/>
                 <w:lang w:val="en-US"/>
               </w:rPr>
-              <w:t>AMALIY KO‘NIKMA</w:t>
+              <w:t xml:space="preserve">AMALIY </w:t>
+            </w:r>
+            <w:proofErr w:type="gramStart"/>
+            <w:r>
+              <w:rPr>
+                <w:sz w:val="18"/>
+                <w:shd w:val="clear" w:color="auto" w:fill="FFFFFF"/>
+                <w:lang w:val="en-US"/>
+              </w:rPr>
+              <w:t>KO‘</w:t>
+            </w:r>
+            <w:proofErr w:type="gramEnd"/>
+            <w:r>
+              <w:rPr>
+                <w:sz w:val="18"/>
+                <w:shd w:val="clear" w:color="auto" w:fill="FFFFFF"/>
+                <w:lang w:val="en-US"/>
+              </w:rPr>
+              <w:t>NIKMA</w:t>
             </w:r>
           </w:p>
           <w:p>
@@ -33419,13 +33658,23 @@
               </w:rPr>
             </w:pPr>
             <w:proofErr w:type="spellStart"/>
+            <w:proofErr w:type="gramStart"/>
             <w:r>
               <w:rPr>
                 <w:sz w:val="18"/>
                 <w:shd w:val="clear" w:color="auto" w:fill="FFFFFF"/>
                 <w:lang w:val="en-US"/>
               </w:rPr>
-              <w:t>O‘tilgan</w:t>
+              <w:t>O‘</w:t>
+            </w:r>
+            <w:proofErr w:type="gramEnd"/>
+            <w:r>
+              <w:rPr>
+                <w:sz w:val="18"/>
+                <w:shd w:val="clear" w:color="auto" w:fill="FFFFFF"/>
+                <w:lang w:val="en-US"/>
+              </w:rPr>
+              <w:t>tilgan</w:t>
             </w:r>
             <w:proofErr w:type="spellEnd"/>
             <w:r>
@@ -33671,13 +33920,23 @@
               <w:t xml:space="preserve">, </w:t>
             </w:r>
             <w:proofErr w:type="spellStart"/>
+            <w:proofErr w:type="gramStart"/>
             <w:r>
               <w:rPr>
                 <w:sz w:val="18"/>
                 <w:shd w:val="clear" w:color="auto" w:fill="FFFFFF"/>
                 <w:lang w:val="en-US"/>
               </w:rPr>
-              <w:t>to‘ldiring</w:t>
+              <w:t>to‘</w:t>
+            </w:r>
+            <w:proofErr w:type="gramEnd"/>
+            <w:r>
+              <w:rPr>
+                <w:sz w:val="18"/>
+                <w:shd w:val="clear" w:color="auto" w:fill="FFFFFF"/>
+                <w:lang w:val="en-US"/>
+              </w:rPr>
+              <w:t>ldiring</w:t>
             </w:r>
             <w:proofErr w:type="spellEnd"/>
             <w:r>
@@ -34971,14 +35230,25 @@
         <w:t xml:space="preserve"> </w:t>
       </w:r>
       <w:proofErr w:type="spellStart"/>
-      <w:r>
-        <w:rPr>
-          <w:sz w:val="28"/>
-          <w:szCs w:val="28"/>
-          <w:shd w:val="clear" w:color="auto" w:fill="FFFFFF"/>
-          <w:lang w:val="en-US"/>
-        </w:rPr>
-        <w:t>o‘kitishdagi</w:t>
+      <w:proofErr w:type="gramStart"/>
+      <w:r>
+        <w:rPr>
+          <w:sz w:val="28"/>
+          <w:szCs w:val="28"/>
+          <w:shd w:val="clear" w:color="auto" w:fill="FFFFFF"/>
+          <w:lang w:val="en-US"/>
+        </w:rPr>
+        <w:t>o‘</w:t>
+      </w:r>
+      <w:proofErr w:type="gramEnd"/>
+      <w:r>
+        <w:rPr>
+          <w:sz w:val="28"/>
+          <w:szCs w:val="28"/>
+          <w:shd w:val="clear" w:color="auto" w:fill="FFFFFF"/>
+          <w:lang w:val="en-US"/>
+        </w:rPr>
+        <w:t>kitishdagi</w:t>
       </w:r>
       <w:proofErr w:type="spellEnd"/>
       <w:r>
@@ -35386,14 +35656,25 @@
         <w:t xml:space="preserve">, </w:t>
       </w:r>
       <w:proofErr w:type="spellStart"/>
-      <w:r>
-        <w:rPr>
-          <w:sz w:val="28"/>
-          <w:szCs w:val="28"/>
-          <w:shd w:val="clear" w:color="auto" w:fill="FFFFFF"/>
-          <w:lang w:val="en-US"/>
-        </w:rPr>
-        <w:t>o‘qituvchi</w:t>
+      <w:proofErr w:type="gramStart"/>
+      <w:r>
+        <w:rPr>
+          <w:sz w:val="28"/>
+          <w:szCs w:val="28"/>
+          <w:shd w:val="clear" w:color="auto" w:fill="FFFFFF"/>
+          <w:lang w:val="en-US"/>
+        </w:rPr>
+        <w:t>o‘</w:t>
+      </w:r>
+      <w:proofErr w:type="gramEnd"/>
+      <w:r>
+        <w:rPr>
+          <w:sz w:val="28"/>
+          <w:szCs w:val="28"/>
+          <w:shd w:val="clear" w:color="auto" w:fill="FFFFFF"/>
+          <w:lang w:val="en-US"/>
+        </w:rPr>
+        <w:t>qituvchi</w:t>
       </w:r>
       <w:proofErr w:type="spellEnd"/>
       <w:r>
@@ -35726,14 +36007,25 @@
         <w:t xml:space="preserve">. </w:t>
       </w:r>
       <w:proofErr w:type="spellStart"/>
-      <w:r>
-        <w:rPr>
-          <w:sz w:val="28"/>
-          <w:szCs w:val="28"/>
-          <w:shd w:val="clear" w:color="auto" w:fill="FFFFFF"/>
-          <w:lang w:val="en-US"/>
-        </w:rPr>
-        <w:t>O‘quv</w:t>
+      <w:proofErr w:type="gramStart"/>
+      <w:r>
+        <w:rPr>
+          <w:sz w:val="28"/>
+          <w:szCs w:val="28"/>
+          <w:shd w:val="clear" w:color="auto" w:fill="FFFFFF"/>
+          <w:lang w:val="en-US"/>
+        </w:rPr>
+        <w:t>O‘</w:t>
+      </w:r>
+      <w:proofErr w:type="gramEnd"/>
+      <w:r>
+        <w:rPr>
+          <w:sz w:val="28"/>
+          <w:szCs w:val="28"/>
+          <w:shd w:val="clear" w:color="auto" w:fill="FFFFFF"/>
+          <w:lang w:val="en-US"/>
+        </w:rPr>
+        <w:t>quv</w:t>
       </w:r>
       <w:proofErr w:type="spellEnd"/>
       <w:r>
@@ -36825,17 +37117,7 @@
           <w:szCs w:val="28"/>
           <w:lang w:val="en-US"/>
         </w:rPr>
-        <w:t xml:space="preserve">        </w:t>
-      </w:r>
-      <w:bookmarkStart w:id="7" w:name="_GoBack"/>
-      <w:bookmarkEnd w:id="7"/>
-      <w:r>
-        <w:rPr>
-          <w:sz w:val="28"/>
-          <w:szCs w:val="28"/>
-          <w:lang w:val="en-US"/>
-        </w:rPr>
-        <w:t xml:space="preserve">                             </w:t>
+        <w:t xml:space="preserve">                                     </w:t>
       </w:r>
       <w:r>
         <w:rPr>
@@ -36853,6 +37135,7 @@
         </w:rPr>
         <w:t xml:space="preserve">   </w:t>
       </w:r>
+      <w:proofErr w:type="gramStart"/>
       <w:r>
         <w:rPr>
           <w:sz w:val="28"/>
@@ -36877,6 +37160,7 @@
         </w:rPr>
         <w:t>Isakov</w:t>
       </w:r>
+      <w:proofErr w:type="gramEnd"/>
     </w:p>
     <w:p>
       <w:pPr>
@@ -40508,6 +40792,7 @@
     <w:lsdException w:name="HTML Sample" w:semiHidden="1" w:unhideWhenUsed="1"/>
     <w:lsdException w:name="HTML Typewriter" w:semiHidden="1" w:unhideWhenUsed="1"/>
     <w:lsdException w:name="HTML Variable" w:semiHidden="1" w:unhideWhenUsed="1"/>
+    <w:lsdException w:name="Normal Table" w:semiHidden="1" w:unhideWhenUsed="1"/>
     <w:lsdException w:name="annotation subject" w:semiHidden="1" w:unhideWhenUsed="1"/>
     <w:lsdException w:name="No List" w:semiHidden="1" w:uiPriority="0" w:unhideWhenUsed="1"/>
     <w:lsdException w:name="Outline List 1" w:semiHidden="1" w:unhideWhenUsed="1"/>
@@ -40554,8 +40839,10 @@
     <w:lsdException w:name="Table Subtle 2" w:semiHidden="1" w:unhideWhenUsed="1"/>
     <w:lsdException w:name="Table Web 1" w:semiHidden="1" w:unhideWhenUsed="1"/>
     <w:lsdException w:name="Table Web 2" w:semiHidden="1" w:unhideWhenUsed="1"/>
+    <w:lsdException w:name="Table Web 3" w:semiHidden="1" w:unhideWhenUsed="1"/>
     <w:lsdException w:name="Balloon Text" w:semiHidden="1" w:unhideWhenUsed="1"/>
     <w:lsdException w:name="Table Grid" w:uiPriority="0"/>
+    <w:lsdException w:name="Table Theme" w:semiHidden="1" w:unhideWhenUsed="1"/>
     <w:lsdException w:name="Placeholder Text" w:semiHidden="1"/>
     <w:lsdException w:name="No Spacing" w:uiPriority="1" w:qFormat="1"/>
     <w:lsdException w:name="Light Shading" w:uiPriority="60"/>

</xml_diff>